<commit_message>
feat(documents): rebuild the IIO forms from the new originals, scrub every template
- iio1_kafolat and iio2_royxat rebuilt from the updated originals; values
  located by place (table cell / label), so no personal data is typed in
  the repo; verify-iio reads them back from the original and proves the
  round trip
- registration request gains what the real form has: out no/date, district
  header, entry date, stay address, housing provider + phone, responsible
  person's name/passport/phones; visa validity is one line, no visa = dash
- templates carried Word's first-page preview image (names and passport
  numbers readable) and author names: scrubbed from all eleven templates;
  a test now enforces it plus placeholders <-> registry one to one
- TabDef.defaults: IIO position cell defaults to 'ishlash uchun'

Co-Authored-By: Claude Sonnet 5.5 <noreply@anthropic.com>
Claude-Session: https://claude.ai/code/session_017Bvkx3qJgxasWy8CRohMRx
</commit_message>
<xml_diff>
--- a/src/lib/documents/templates/iio1_kafolat.docx
+++ b/src/lib/documents/templates/iio1_kafolat.docx
@@ -158,7 +158,7 @@
                 <w:szCs w:val="24"/>
                 <w:lang w:val="en-US"/>
               </w:rPr>
-              <w:softHyphen/>
+              <w:t xml:space="preserve"/>
             </w:r>
             <w:r>
               <w:rPr>
@@ -167,9 +167,19 @@
                 <w:szCs w:val="24"/>
                 <w:lang w:val="en-US"/>
               </w:rPr>
-              <w:softHyphen/>
               <w:t xml:space="preserve"/>
             </w:r>
+            <w:proofErr w:type="spellStart"/>
+            <w:r>
+              <w:rPr>
+                <w:rFonts w:ascii="Times New Roman" w:hAnsi="Times New Roman" w:cs="Times New Roman"/>
+                <w:sz w:val="24"/>
+                <w:szCs w:val="24"/>
+                <w:lang w:val="en-US"/>
+              </w:rPr>
+              <w:t xml:space="preserve"/>
+            </w:r>
+            <w:proofErr w:type="spellEnd"/>
           </w:p>
         </w:tc>
         <w:tc>
@@ -531,7 +541,6 @@
         </w:rPr>
         <w:t xml:space="preserve"> </w:t>
       </w:r>
-      <w:proofErr w:type="spellStart"/>
       <w:r>
         <w:rPr>
           <w:rFonts w:ascii="Times New Roman" w:hAnsi="Times New Roman" w:cs="Times New Roman"/>
@@ -541,7 +550,6 @@
         </w:rPr>
         <w:t xml:space="preserve">{{citizenship}}</w:t>
       </w:r>
-      <w:proofErr w:type="spellEnd"/>
       <w:r>
         <w:rPr>
           <w:rFonts w:ascii="Times New Roman" w:hAnsi="Times New Roman" w:cs="Times New Roman"/>
@@ -1730,6 +1738,26 @@
               <w:t xml:space="preserve"/>
             </w:r>
             <w:proofErr w:type="spellEnd"/>
+            <w:r>
+              <w:rPr>
+                <w:rFonts w:ascii="Times New Roman" w:hAnsi="Times New Roman" w:cs="Times New Roman"/>
+                <w:sz w:val="20"/>
+                <w:szCs w:val="20"/>
+                <w:lang w:val="en-US"/>
+              </w:rPr>
+              <w:t xml:space="preserve"/>
+            </w:r>
+            <w:proofErr w:type="spellStart"/>
+            <w:r>
+              <w:rPr>
+                <w:rFonts w:ascii="Times New Roman" w:hAnsi="Times New Roman" w:cs="Times New Roman"/>
+                <w:sz w:val="20"/>
+                <w:szCs w:val="20"/>
+                <w:lang w:val="en-US"/>
+              </w:rPr>
+              <w:t xml:space="preserve"/>
+            </w:r>
+            <w:proofErr w:type="spellEnd"/>
           </w:p>
         </w:tc>
         <w:tc>
@@ -1766,6 +1794,7 @@
                 <w:lang w:val="en-US"/>
               </w:rPr>
             </w:pPr>
+            <w:proofErr w:type="spellStart"/>
             <w:r>
               <w:rPr>
                 <w:rFonts w:ascii="Times New Roman" w:hAnsi="Times New Roman" w:cs="Times New Roman"/>
@@ -1775,6 +1804,9 @@
               </w:rPr>
               <w:t xml:space="preserve">{{birthplace}}</w:t>
             </w:r>
+            <w:bookmarkStart w:id="0" w:name="_GoBack"/>
+            <w:bookmarkEnd w:id="0"/>
+            <w:proofErr w:type="spellEnd"/>
           </w:p>
         </w:tc>
         <w:tc>
@@ -1791,17 +1823,15 @@
                 <w:lang w:val="en-US"/>
               </w:rPr>
             </w:pPr>
-            <w:proofErr w:type="spellStart"/>
-            <w:r>
-              <w:rPr>
-                <w:rFonts w:ascii="Times New Roman" w:hAnsi="Times New Roman" w:cs="Times New Roman"/>
-                <w:sz w:val="20"/>
-                <w:szCs w:val="20"/>
+            <w:r>
+              <w:rPr>
+                <w:rFonts w:ascii="Times New Roman" w:hAnsi="Times New Roman" w:cs="Times New Roman"/>
+                <w:sz w:val="24"/>
+                <w:szCs w:val="24"/>
                 <w:lang w:val="en-US"/>
               </w:rPr>
               <w:t xml:space="preserve">{{citizenship}}</w:t>
             </w:r>
-            <w:proofErr w:type="spellEnd"/>
           </w:p>
         </w:tc>
         <w:tc>
@@ -2069,8 +2099,6 @@
           <w:lang w:val="en-US"/>
         </w:rPr>
       </w:pPr>
-      <w:bookmarkStart w:id="0" w:name="_GoBack"/>
-      <w:bookmarkEnd w:id="0"/>
     </w:p>
     <w:tbl>
       <w:tblPr>
@@ -3155,7 +3183,7 @@
 </file>
 
 <file path=customXml/itemProps1.xml><?xml version="1.0" encoding="utf-8"?>
-<ds:datastoreItem xmlns:ds="http://schemas.openxmlformats.org/officeDocument/2006/customXml" ds:itemID="{36942DCE-D319-4E54-A4CC-64B4F2FB03F9}">
+<ds:datastoreItem xmlns:ds="http://schemas.openxmlformats.org/officeDocument/2006/customXml" ds:itemID="{A130E47A-3BB4-4485-9A89-F7899295EA29}">
   <ds:schemaRefs>
     <ds:schemaRef ds:uri="http://schemas.openxmlformats.org/officeDocument/2006/bibliography"/>
   </ds:schemaRefs>

</xml_diff>